<commit_message>
gitAuto manual push @ 2026-05-13 16:35:51
</commit_message>
<xml_diff>
--- a/docs/Report/网络管理与运维实验1 网络工程2301班-雷若奇-23053020134.docx
+++ b/docs/Report/网络管理与运维实验1 网络工程2301班-雷若奇-23053020134.docx
@@ -353,11 +353,12 @@
           <w:szCs w:val="24"/>
         </w:rPr>
       </w:pPr>
+      <w:bookmarkStart w:id="0" w:name="_GoBack"/>
       <w:r>
         <w:drawing>
           <wp:inline distT="0" distB="0" distL="114300" distR="114300">
-            <wp:extent cx="5259070" cy="3057525"/>
-            <wp:effectExtent l="0" t="0" r="17780" b="9525"/>
+            <wp:extent cx="5258435" cy="3057525"/>
+            <wp:effectExtent l="0" t="0" r="18415" b="9525"/>
             <wp:docPr id="4" name="图片 1"/>
             <wp:cNvGraphicFramePr>
               <a:graphicFrameLocks xmlns:a="http://schemas.openxmlformats.org/drawingml/2006/main" noChangeAspect="1"/>
@@ -380,7 +381,7 @@
                   <pic:spPr>
                     <a:xfrm>
                       <a:off x="0" y="0"/>
-                      <a:ext cx="5259070" cy="3057525"/>
+                      <a:ext cx="5258435" cy="3057525"/>
                     </a:xfrm>
                     <a:prstGeom prst="rect">
                       <a:avLst/>
@@ -396,6 +397,7 @@
           </wp:inline>
         </w:drawing>
       </w:r>
+      <w:bookmarkEnd w:id="0"/>
     </w:p>
     <w:p>
       <w:pPr>
@@ -431,8 +433,8 @@
       <w:r>
         <w:drawing>
           <wp:inline distT="0" distB="0" distL="114300" distR="114300">
-            <wp:extent cx="5259070" cy="3057525"/>
-            <wp:effectExtent l="0" t="0" r="17780" b="9525"/>
+            <wp:extent cx="5258435" cy="3057525"/>
+            <wp:effectExtent l="0" t="0" r="18415" b="9525"/>
             <wp:docPr id="5" name="图片 2"/>
             <wp:cNvGraphicFramePr>
               <a:graphicFrameLocks xmlns:a="http://schemas.openxmlformats.org/drawingml/2006/main" noChangeAspect="1"/>
@@ -455,7 +457,7 @@
                   <pic:spPr>
                     <a:xfrm>
                       <a:off x="0" y="0"/>
-                      <a:ext cx="5259070" cy="3057525"/>
+                      <a:ext cx="5258435" cy="3057525"/>
                     </a:xfrm>
                     <a:prstGeom prst="rect">
                       <a:avLst/>
@@ -477,8 +479,8 @@
       <w:r>
         <w:drawing>
           <wp:inline distT="0" distB="0" distL="114300" distR="114300">
-            <wp:extent cx="5259070" cy="3057525"/>
-            <wp:effectExtent l="0" t="0" r="17780" b="9525"/>
+            <wp:extent cx="5258435" cy="3057525"/>
+            <wp:effectExtent l="0" t="0" r="18415" b="9525"/>
             <wp:docPr id="6" name="图片 3"/>
             <wp:cNvGraphicFramePr>
               <a:graphicFrameLocks xmlns:a="http://schemas.openxmlformats.org/drawingml/2006/main" noChangeAspect="1"/>
@@ -501,7 +503,7 @@
                   <pic:spPr>
                     <a:xfrm>
                       <a:off x="0" y="0"/>
-                      <a:ext cx="5259070" cy="3057525"/>
+                      <a:ext cx="5258435" cy="3057525"/>
                     </a:xfrm>
                     <a:prstGeom prst="rect">
                       <a:avLst/>
@@ -517,8 +519,6 @@
           </wp:inline>
         </w:drawing>
       </w:r>
-      <w:bookmarkStart w:id="0" w:name="_GoBack"/>
-      <w:bookmarkEnd w:id="0"/>
     </w:p>
     <w:p>
       <w:pPr>
@@ -562,8 +562,8 @@
         </w:rPr>
         <w:drawing>
           <wp:inline distT="0" distB="0" distL="114300" distR="114300">
-            <wp:extent cx="5259070" cy="3057525"/>
-            <wp:effectExtent l="0" t="0" r="17780" b="9525"/>
+            <wp:extent cx="5258435" cy="3057525"/>
+            <wp:effectExtent l="0" t="0" r="18415" b="9525"/>
             <wp:docPr id="1" name="图片 1" descr="be8a21ef-a7a2-4585-b5a2-7e88b9d1c111"/>
             <wp:cNvGraphicFramePr>
               <a:graphicFrameLocks xmlns:a="http://schemas.openxmlformats.org/drawingml/2006/main" noChangeAspect="1"/>
@@ -586,7 +586,7 @@
                   <pic:spPr>
                     <a:xfrm>
                       <a:off x="0" y="0"/>
-                      <a:ext cx="5259070" cy="3057525"/>
+                      <a:ext cx="5258435" cy="3057525"/>
                     </a:xfrm>
                     <a:prstGeom prst="rect">
                       <a:avLst/>
@@ -616,8 +616,8 @@
         </w:rPr>
         <w:drawing>
           <wp:inline distT="0" distB="0" distL="114300" distR="114300">
-            <wp:extent cx="5259070" cy="3057525"/>
-            <wp:effectExtent l="0" t="0" r="17780" b="9525"/>
+            <wp:extent cx="5258435" cy="3057525"/>
+            <wp:effectExtent l="0" t="0" r="18415" b="9525"/>
             <wp:docPr id="3" name="图片 3" descr="9de2e262-ec9f-43e2-b441-dd20bf7925f3"/>
             <wp:cNvGraphicFramePr>
               <a:graphicFrameLocks xmlns:a="http://schemas.openxmlformats.org/drawingml/2006/main" noChangeAspect="1"/>
@@ -640,7 +640,7 @@
                   <pic:spPr>
                     <a:xfrm>
                       <a:off x="0" y="0"/>
-                      <a:ext cx="5259070" cy="3057525"/>
+                      <a:ext cx="5258435" cy="3057525"/>
                     </a:xfrm>
                     <a:prstGeom prst="rect">
                       <a:avLst/>

</xml_diff>